<commit_message>
fix: resolve 404 on creator video review API and remove all duplicate budoux scripts site-wide
</commit_message>
<xml_diff>
--- a/資材注意項目は.docx
+++ b/資材注意項目は.docx
@@ -52,7 +52,7 @@
       </w:pPr>
       <w:r>
         <w:pict w14:anchorId="1062F579">
-          <v:rect id="_x0000_i1037" style="width:0;height:1.5pt" o:hralign="center" o:hrstd="t" o:hr="t" fillcolor="#a0a0a0" stroked="f">
+          <v:rect id="_x0000_i1025" style="width:0;height:1.5pt" o:hralign="center" o:hrstd="t" o:hr="t" fillcolor="#a0a0a0" stroked="f">
             <v:textbox inset="5.85pt,.7pt,5.85pt,.7pt"/>
           </v:rect>
         </w:pict>
@@ -214,7 +214,22 @@
           <w:b/>
           <w:bCs/>
         </w:rPr>
-        <w:t>3. 鮮魚コーナー特有の考慮事項（重要）</w:t>
+        <w:t>3. 鮮魚コーナー特有の考慮事項（</w:t>
+      </w:r>
+      <w:r>
+        <w:rPr>
+          <w:b/>
+          <w:bCs/>
+          <w:color w:val="EE0000"/>
+        </w:rPr>
+        <w:t>重要</w:t>
+      </w:r>
+      <w:r>
+        <w:rPr>
+          <w:b/>
+          <w:bCs/>
+        </w:rPr>
+        <w:t>）</w:t>
       </w:r>
     </w:p>
     <w:p>
@@ -265,6 +280,1066 @@
     </w:p>
     <w:p>
       <w:pPr>
+        <w:numPr>
+          <w:ilvl w:val="0"/>
+          <w:numId w:val="3"/>
+        </w:numPr>
+        <w:snapToGrid w:val="0"/>
+      </w:pPr>
+      <w:r>
+        <w:rPr>
+          <w:rFonts w:hint="eastAsia"/>
+        </w:rPr>
+        <w:t>2.</w:t>
+      </w:r>
+    </w:p>
+    <w:p>
+      <w:pPr>
+        <w:numPr>
+          <w:ilvl w:val="0"/>
+          <w:numId w:val="3"/>
+        </w:numPr>
+        <w:snapToGrid w:val="0"/>
+      </w:pPr>
+      <w:r>
+        <w:t>setup_retail_signage.bat</w:t>
+      </w:r>
+      <w:r>
+        <w:rPr>
+          <w:rFonts w:hint="eastAsia"/>
+        </w:rPr>
+        <w:t>をセットアップして</w:t>
+      </w:r>
+    </w:p>
+    <w:p>
+      <w:pPr>
+        <w:pStyle w:val="a9"/>
+        <w:widowControl/>
+        <w:numPr>
+          <w:ilvl w:val="0"/>
+          <w:numId w:val="3"/>
+        </w:numPr>
+        <w:jc w:val="left"/>
+        <w:rPr>
+          <w:rFonts w:ascii="Courier New" w:eastAsia="ＭＳ Ｐゴシック" w:hAnsi="Courier New" w:cs="Courier New"/>
+          <w:color w:val="EE0000"/>
+          <w:kern w:val="0"/>
+          <w:sz w:val="18"/>
+          <w:szCs w:val="18"/>
+          <w14:ligatures w14:val="none"/>
+        </w:rPr>
+      </w:pPr>
+      <w:r>
+        <w:rPr>
+          <w:rFonts w:ascii="Courier New" w:eastAsia="ＭＳ Ｐゴシック" w:hAnsi="Courier New" w:cs="Courier New"/>
+          <w:color w:val="EE0000"/>
+          <w:kern w:val="0"/>
+          <w:sz w:val="18"/>
+          <w:szCs w:val="18"/>
+          <w:bdr w:val="single" w:sz="2" w:space="0" w:color="E5E7EB" w:frame="1"/>
+          <w14:ligatures w14:val="none"/>
+        </w:rPr>
+        <w:t>【設置する</w:t>
+      </w:r>
+      <w:r>
+        <w:rPr>
+          <w:rFonts w:ascii="Courier New" w:eastAsia="ＭＳ Ｐゴシック" w:hAnsi="Courier New" w:cs="Courier New"/>
+          <w:color w:val="EE0000"/>
+          <w:kern w:val="0"/>
+          <w:sz w:val="18"/>
+          <w:szCs w:val="18"/>
+          <w:bdr w:val="single" w:sz="2" w:space="0" w:color="E5E7EB" w:frame="1"/>
+          <w14:ligatures w14:val="none"/>
+        </w:rPr>
+        <w:t>LED</w:t>
+      </w:r>
+      <w:r>
+        <w:rPr>
+          <w:rFonts w:ascii="Courier New" w:eastAsia="ＭＳ Ｐゴシック" w:hAnsi="Courier New" w:cs="Courier New"/>
+          <w:color w:val="EE0000"/>
+          <w:kern w:val="0"/>
+          <w:sz w:val="18"/>
+          <w:szCs w:val="18"/>
+          <w:bdr w:val="single" w:sz="2" w:space="0" w:color="E5E7EB" w:frame="1"/>
+          <w14:ligatures w14:val="none"/>
+        </w:rPr>
+        <w:t>パネルの種類を選択してください】</w:t>
+      </w:r>
+    </w:p>
+    <w:p>
+      <w:pPr>
+        <w:pStyle w:val="a9"/>
+        <w:widowControl/>
+        <w:numPr>
+          <w:ilvl w:val="0"/>
+          <w:numId w:val="3"/>
+        </w:numPr>
+        <w:jc w:val="left"/>
+        <w:rPr>
+          <w:rFonts w:ascii="Courier New" w:eastAsia="ＭＳ Ｐゴシック" w:hAnsi="Courier New" w:cs="Courier New"/>
+          <w:color w:val="EE0000"/>
+          <w:kern w:val="0"/>
+          <w:sz w:val="18"/>
+          <w:szCs w:val="18"/>
+          <w14:ligatures w14:val="none"/>
+        </w:rPr>
+      </w:pPr>
+      <w:r>
+        <w:rPr>
+          <w:rFonts w:ascii="Courier New" w:eastAsia="ＭＳ Ｐゴシック" w:hAnsi="Courier New" w:cs="Courier New"/>
+          <w:color w:val="EE0000"/>
+          <w:kern w:val="0"/>
+          <w:sz w:val="18"/>
+          <w:szCs w:val="18"/>
+          <w:bdr w:val="single" w:sz="2" w:space="0" w:color="E5E7EB" w:frame="1"/>
+          <w14:ligatures w14:val="none"/>
+        </w:rPr>
+        <w:t xml:space="preserve">[1] </w:t>
+      </w:r>
+      <w:r>
+        <w:rPr>
+          <w:rFonts w:ascii="Courier New" w:eastAsia="ＭＳ Ｐゴシック" w:hAnsi="Courier New" w:cs="Courier New"/>
+          <w:color w:val="EE0000"/>
+          <w:kern w:val="0"/>
+          <w:sz w:val="18"/>
+          <w:szCs w:val="18"/>
+          <w:bdr w:val="single" w:sz="2" w:space="0" w:color="E5E7EB" w:frame="1"/>
+          <w14:ligatures w14:val="none"/>
+        </w:rPr>
+        <w:t>鮮魚対面ガラス用</w:t>
+      </w:r>
+      <w:r>
+        <w:rPr>
+          <w:rFonts w:ascii="Courier New" w:eastAsia="ＭＳ Ｐゴシック" w:hAnsi="Courier New" w:cs="Courier New"/>
+          <w:color w:val="EE0000"/>
+          <w:kern w:val="0"/>
+          <w:sz w:val="18"/>
+          <w:szCs w:val="18"/>
+          <w:bdr w:val="single" w:sz="2" w:space="0" w:color="E5E7EB" w:frame="1"/>
+          <w14:ligatures w14:val="none"/>
+        </w:rPr>
+        <w:t xml:space="preserve"> (1000 × 300)</w:t>
+      </w:r>
+    </w:p>
+    <w:p>
+      <w:pPr>
+        <w:pStyle w:val="a9"/>
+        <w:widowControl/>
+        <w:numPr>
+          <w:ilvl w:val="0"/>
+          <w:numId w:val="3"/>
+        </w:numPr>
+        <w:jc w:val="left"/>
+        <w:rPr>
+          <w:rFonts w:ascii="Courier New" w:eastAsia="ＭＳ Ｐゴシック" w:hAnsi="Courier New" w:cs="Courier New"/>
+          <w:color w:val="EE0000"/>
+          <w:kern w:val="0"/>
+          <w:sz w:val="18"/>
+          <w:szCs w:val="18"/>
+          <w14:ligatures w14:val="none"/>
+        </w:rPr>
+      </w:pPr>
+      <w:r>
+        <w:rPr>
+          <w:rFonts w:ascii="Courier New" w:eastAsia="ＭＳ Ｐゴシック" w:hAnsi="Courier New" w:cs="Courier New"/>
+          <w:color w:val="EE0000"/>
+          <w:kern w:val="0"/>
+          <w:sz w:val="18"/>
+          <w:szCs w:val="18"/>
+          <w:bdr w:val="single" w:sz="2" w:space="0" w:color="E5E7EB" w:frame="1"/>
+          <w14:ligatures w14:val="none"/>
+        </w:rPr>
+        <w:t xml:space="preserve">[2] </w:t>
+      </w:r>
+      <w:r>
+        <w:rPr>
+          <w:rFonts w:ascii="Courier New" w:eastAsia="ＭＳ Ｐゴシック" w:hAnsi="Courier New" w:cs="Courier New"/>
+          <w:color w:val="EE0000"/>
+          <w:kern w:val="0"/>
+          <w:sz w:val="18"/>
+          <w:szCs w:val="18"/>
+          <w:bdr w:val="single" w:sz="2" w:space="0" w:color="E5E7EB" w:frame="1"/>
+          <w14:ligatures w14:val="none"/>
+        </w:rPr>
+        <w:t>冷蔵庫ドア用</w:t>
+      </w:r>
+      <w:r>
+        <w:rPr>
+          <w:rFonts w:ascii="Courier New" w:eastAsia="ＭＳ Ｐゴシック" w:hAnsi="Courier New" w:cs="Courier New"/>
+          <w:color w:val="EE0000"/>
+          <w:kern w:val="0"/>
+          <w:sz w:val="18"/>
+          <w:szCs w:val="18"/>
+          <w:bdr w:val="single" w:sz="2" w:space="0" w:color="E5E7EB" w:frame="1"/>
+          <w14:ligatures w14:val="none"/>
+        </w:rPr>
+        <w:t xml:space="preserve"> (500 × 1000)</w:t>
+      </w:r>
+    </w:p>
+    <w:p>
+      <w:pPr>
+        <w:pStyle w:val="a9"/>
+        <w:widowControl/>
+        <w:numPr>
+          <w:ilvl w:val="0"/>
+          <w:numId w:val="3"/>
+        </w:numPr>
+        <w:jc w:val="left"/>
+        <w:rPr>
+          <w:rFonts w:ascii="Courier New" w:eastAsia="ＭＳ Ｐゴシック" w:hAnsi="Courier New" w:cs="Courier New"/>
+          <w:color w:val="EE0000"/>
+          <w:kern w:val="0"/>
+          <w:sz w:val="18"/>
+          <w:szCs w:val="18"/>
+          <w14:ligatures w14:val="none"/>
+        </w:rPr>
+      </w:pPr>
+      <w:r>
+        <w:rPr>
+          <w:rFonts w:ascii="Courier New" w:eastAsia="ＭＳ Ｐゴシック" w:hAnsi="Courier New" w:cs="Courier New"/>
+          <w:color w:val="EE0000"/>
+          <w:kern w:val="0"/>
+          <w:sz w:val="18"/>
+          <w:szCs w:val="18"/>
+          <w:bdr w:val="single" w:sz="2" w:space="0" w:color="E5E7EB" w:frame="1"/>
+          <w14:ligatures w14:val="none"/>
+        </w:rPr>
+        <w:t xml:space="preserve">[3] </w:t>
+      </w:r>
+      <w:r>
+        <w:rPr>
+          <w:rFonts w:ascii="Courier New" w:eastAsia="ＭＳ Ｐゴシック" w:hAnsi="Courier New" w:cs="Courier New"/>
+          <w:color w:val="EE0000"/>
+          <w:kern w:val="0"/>
+          <w:sz w:val="18"/>
+          <w:szCs w:val="18"/>
+          <w:bdr w:val="single" w:sz="2" w:space="0" w:color="E5E7EB" w:frame="1"/>
+          <w14:ligatures w14:val="none"/>
+        </w:rPr>
+        <w:t>エンド上部用</w:t>
+      </w:r>
+      <w:r>
+        <w:rPr>
+          <w:rFonts w:ascii="Courier New" w:eastAsia="ＭＳ Ｐゴシック" w:hAnsi="Courier New" w:cs="Courier New"/>
+          <w:color w:val="EE0000"/>
+          <w:kern w:val="0"/>
+          <w:sz w:val="18"/>
+          <w:szCs w:val="18"/>
+          <w:bdr w:val="single" w:sz="2" w:space="0" w:color="E5E7EB" w:frame="1"/>
+          <w14:ligatures w14:val="none"/>
+        </w:rPr>
+        <w:t xml:space="preserve"> (900 × 200)</w:t>
+      </w:r>
+    </w:p>
+    <w:p>
+      <w:pPr>
+        <w:pStyle w:val="a9"/>
+        <w:widowControl/>
+        <w:numPr>
+          <w:ilvl w:val="0"/>
+          <w:numId w:val="3"/>
+        </w:numPr>
+        <w:jc w:val="left"/>
+        <w:rPr>
+          <w:rFonts w:ascii="Courier New" w:eastAsia="ＭＳ Ｐゴシック" w:hAnsi="Courier New" w:cs="Courier New"/>
+          <w:color w:val="EE0000"/>
+          <w:kern w:val="0"/>
+          <w:sz w:val="18"/>
+          <w:szCs w:val="18"/>
+          <w14:ligatures w14:val="none"/>
+        </w:rPr>
+      </w:pPr>
+      <w:r>
+        <w:rPr>
+          <w:rFonts w:ascii="Courier New" w:eastAsia="ＭＳ Ｐゴシック" w:hAnsi="Courier New" w:cs="Courier New"/>
+          <w:color w:val="EE0000"/>
+          <w:kern w:val="0"/>
+          <w:sz w:val="18"/>
+          <w:szCs w:val="18"/>
+          <w:bdr w:val="single" w:sz="2" w:space="0" w:color="E5E7EB" w:frame="1"/>
+          <w14:ligatures w14:val="none"/>
+        </w:rPr>
+        <w:t xml:space="preserve">[4] </w:t>
+      </w:r>
+      <w:r>
+        <w:rPr>
+          <w:rFonts w:ascii="Courier New" w:eastAsia="ＭＳ Ｐゴシック" w:hAnsi="Courier New" w:cs="Courier New"/>
+          <w:color w:val="EE0000"/>
+          <w:kern w:val="0"/>
+          <w:sz w:val="18"/>
+          <w:szCs w:val="18"/>
+          <w:bdr w:val="single" w:sz="2" w:space="0" w:color="E5E7EB" w:frame="1"/>
+          <w14:ligatures w14:val="none"/>
+        </w:rPr>
+        <w:t>棚割り</w:t>
+      </w:r>
+      <w:r>
+        <w:rPr>
+          <w:rFonts w:ascii="Courier New" w:eastAsia="ＭＳ Ｐゴシック" w:hAnsi="Courier New" w:cs="Courier New"/>
+          <w:color w:val="EE0000"/>
+          <w:kern w:val="0"/>
+          <w:sz w:val="18"/>
+          <w:szCs w:val="18"/>
+          <w:bdr w:val="single" w:sz="2" w:space="0" w:color="E5E7EB" w:frame="1"/>
+          <w14:ligatures w14:val="none"/>
+        </w:rPr>
+        <w:t>(</w:t>
+      </w:r>
+      <w:r>
+        <w:rPr>
+          <w:rFonts w:ascii="Courier New" w:eastAsia="ＭＳ Ｐゴシック" w:hAnsi="Courier New" w:cs="Courier New"/>
+          <w:color w:val="EE0000"/>
+          <w:kern w:val="0"/>
+          <w:sz w:val="18"/>
+          <w:szCs w:val="18"/>
+          <w:bdr w:val="single" w:sz="2" w:space="0" w:color="E5E7EB" w:frame="1"/>
+          <w14:ligatures w14:val="none"/>
+        </w:rPr>
+        <w:t>電子棚札</w:t>
+      </w:r>
+      <w:r>
+        <w:rPr>
+          <w:rFonts w:ascii="Courier New" w:eastAsia="ＭＳ Ｐゴシック" w:hAnsi="Courier New" w:cs="Courier New"/>
+          <w:color w:val="EE0000"/>
+          <w:kern w:val="0"/>
+          <w:sz w:val="18"/>
+          <w:szCs w:val="18"/>
+          <w:bdr w:val="single" w:sz="2" w:space="0" w:color="E5E7EB" w:frame="1"/>
+          <w14:ligatures w14:val="none"/>
+        </w:rPr>
+        <w:t>) (900 × 100)</w:t>
+      </w:r>
+    </w:p>
+    <w:p>
+      <w:pPr>
+        <w:pStyle w:val="a9"/>
+        <w:widowControl/>
+        <w:numPr>
+          <w:ilvl w:val="0"/>
+          <w:numId w:val="3"/>
+        </w:numPr>
+        <w:jc w:val="left"/>
+        <w:rPr>
+          <w:rFonts w:ascii="Courier New" w:eastAsia="ＭＳ Ｐゴシック" w:hAnsi="Courier New" w:cs="Courier New"/>
+          <w:color w:val="EE0000"/>
+          <w:kern w:val="0"/>
+          <w:sz w:val="18"/>
+          <w:szCs w:val="18"/>
+          <w14:ligatures w14:val="none"/>
+        </w:rPr>
+      </w:pPr>
+      <w:r>
+        <w:rPr>
+          <w:rFonts w:ascii="Courier New" w:eastAsia="ＭＳ Ｐゴシック" w:hAnsi="Courier New" w:cs="Courier New"/>
+          <w:color w:val="EE0000"/>
+          <w:kern w:val="0"/>
+          <w:sz w:val="18"/>
+          <w:szCs w:val="18"/>
+          <w:bdr w:val="single" w:sz="2" w:space="0" w:color="E5E7EB" w:frame="1"/>
+          <w14:ligatures w14:val="none"/>
+        </w:rPr>
+        <w:t xml:space="preserve">[5] </w:t>
+      </w:r>
+      <w:r>
+        <w:rPr>
+          <w:rFonts w:ascii="Courier New" w:eastAsia="ＭＳ Ｐゴシック" w:hAnsi="Courier New" w:cs="Courier New"/>
+          <w:color w:val="EE0000"/>
+          <w:kern w:val="0"/>
+          <w:sz w:val="18"/>
+          <w:szCs w:val="18"/>
+          <w:bdr w:val="single" w:sz="2" w:space="0" w:color="E5E7EB" w:frame="1"/>
+          <w14:ligatures w14:val="none"/>
+        </w:rPr>
+        <w:t>普通のテレビ・モニター</w:t>
+      </w:r>
+      <w:r>
+        <w:rPr>
+          <w:rFonts w:ascii="Courier New" w:eastAsia="ＭＳ Ｐゴシック" w:hAnsi="Courier New" w:cs="Courier New"/>
+          <w:color w:val="EE0000"/>
+          <w:kern w:val="0"/>
+          <w:sz w:val="18"/>
+          <w:szCs w:val="18"/>
+          <w:bdr w:val="single" w:sz="2" w:space="0" w:color="E5E7EB" w:frame="1"/>
+          <w14:ligatures w14:val="none"/>
+        </w:rPr>
+        <w:t xml:space="preserve"> (</w:t>
+      </w:r>
+      <w:r>
+        <w:rPr>
+          <w:rFonts w:ascii="Courier New" w:eastAsia="ＭＳ Ｐゴシック" w:hAnsi="Courier New" w:cs="Courier New"/>
+          <w:color w:val="EE0000"/>
+          <w:kern w:val="0"/>
+          <w:sz w:val="18"/>
+          <w:szCs w:val="18"/>
+          <w:bdr w:val="single" w:sz="2" w:space="0" w:color="E5E7EB" w:frame="1"/>
+          <w14:ligatures w14:val="none"/>
+        </w:rPr>
+        <w:t>横型</w:t>
+      </w:r>
+      <w:r>
+        <w:rPr>
+          <w:rFonts w:ascii="Courier New" w:eastAsia="ＭＳ Ｐゴシック" w:hAnsi="Courier New" w:cs="Courier New"/>
+          <w:color w:val="EE0000"/>
+          <w:kern w:val="0"/>
+          <w:sz w:val="18"/>
+          <w:szCs w:val="18"/>
+          <w:bdr w:val="single" w:sz="2" w:space="0" w:color="E5E7EB" w:frame="1"/>
+          <w14:ligatures w14:val="none"/>
+        </w:rPr>
+        <w:t xml:space="preserve"> 16:9)</w:t>
+      </w:r>
+    </w:p>
+    <w:p>
+      <w:pPr>
+        <w:pStyle w:val="a9"/>
+        <w:widowControl/>
+        <w:numPr>
+          <w:ilvl w:val="0"/>
+          <w:numId w:val="3"/>
+        </w:numPr>
+        <w:jc w:val="left"/>
+        <w:rPr>
+          <w:rFonts w:ascii="Courier New" w:eastAsia="ＭＳ Ｐゴシック" w:hAnsi="Courier New" w:cs="Courier New"/>
+          <w:color w:val="EE0000"/>
+          <w:kern w:val="0"/>
+          <w:sz w:val="18"/>
+          <w:szCs w:val="18"/>
+          <w14:ligatures w14:val="none"/>
+        </w:rPr>
+      </w:pPr>
+      <w:r>
+        <w:rPr>
+          <w:rFonts w:ascii="Courier New" w:eastAsia="ＭＳ Ｐゴシック" w:hAnsi="Courier New" w:cs="Courier New"/>
+          <w:color w:val="EE0000"/>
+          <w:kern w:val="0"/>
+          <w:sz w:val="18"/>
+          <w:szCs w:val="18"/>
+          <w:bdr w:val="single" w:sz="2" w:space="0" w:color="E5E7EB" w:frame="1"/>
+          <w14:ligatures w14:val="none"/>
+        </w:rPr>
+        <w:t>番号</w:t>
+      </w:r>
+      <w:r>
+        <w:rPr>
+          <w:rFonts w:ascii="Courier New" w:eastAsia="ＭＳ Ｐゴシック" w:hAnsi="Courier New" w:cs="Courier New"/>
+          <w:color w:val="EE0000"/>
+          <w:kern w:val="0"/>
+          <w:sz w:val="18"/>
+          <w:szCs w:val="18"/>
+          <w:bdr w:val="single" w:sz="2" w:space="0" w:color="E5E7EB" w:frame="1"/>
+          <w14:ligatures w14:val="none"/>
+        </w:rPr>
+        <w:t xml:space="preserve"> (1-5) </w:t>
+      </w:r>
+      <w:r>
+        <w:rPr>
+          <w:rFonts w:ascii="Courier New" w:eastAsia="ＭＳ Ｐゴシック" w:hAnsi="Courier New" w:cs="Courier New"/>
+          <w:color w:val="EE0000"/>
+          <w:kern w:val="0"/>
+          <w:sz w:val="18"/>
+          <w:szCs w:val="18"/>
+          <w:bdr w:val="single" w:sz="2" w:space="0" w:color="E5E7EB" w:frame="1"/>
+          <w14:ligatures w14:val="none"/>
+        </w:rPr>
+        <w:t>を入力して</w:t>
+      </w:r>
+      <w:r>
+        <w:rPr>
+          <w:rFonts w:ascii="Courier New" w:eastAsia="ＭＳ Ｐゴシック" w:hAnsi="Courier New" w:cs="Courier New"/>
+          <w:color w:val="EE0000"/>
+          <w:kern w:val="0"/>
+          <w:sz w:val="18"/>
+          <w:szCs w:val="18"/>
+          <w:bdr w:val="single" w:sz="2" w:space="0" w:color="E5E7EB" w:frame="1"/>
+          <w14:ligatures w14:val="none"/>
+        </w:rPr>
+        <w:t>Enter</w:t>
+      </w:r>
+      <w:r>
+        <w:rPr>
+          <w:rFonts w:ascii="Courier New" w:eastAsia="ＭＳ Ｐゴシック" w:hAnsi="Courier New" w:cs="Courier New"/>
+          <w:color w:val="EE0000"/>
+          <w:kern w:val="0"/>
+          <w:sz w:val="18"/>
+          <w:szCs w:val="18"/>
+          <w:bdr w:val="single" w:sz="2" w:space="0" w:color="E5E7EB" w:frame="1"/>
+          <w14:ligatures w14:val="none"/>
+        </w:rPr>
+        <w:t>を押してください</w:t>
+      </w:r>
+      <w:r>
+        <w:rPr>
+          <w:rFonts w:ascii="Courier New" w:eastAsia="ＭＳ Ｐゴシック" w:hAnsi="Courier New" w:cs="Courier New"/>
+          <w:color w:val="EE0000"/>
+          <w:kern w:val="0"/>
+          <w:sz w:val="18"/>
+          <w:szCs w:val="18"/>
+          <w:bdr w:val="single" w:sz="2" w:space="0" w:color="E5E7EB" w:frame="1"/>
+          <w14:ligatures w14:val="none"/>
+        </w:rPr>
+        <w:t>: _</w:t>
+      </w:r>
+    </w:p>
+    <w:p>
+      <w:pPr>
+        <w:snapToGrid w:val="0"/>
+      </w:pPr>
+    </w:p>
+    <w:p>
+      <w:pPr>
+        <w:snapToGrid w:val="0"/>
+      </w:pPr>
+      <w:r>
+        <w:rPr>
+          <w:rFonts w:hint="eastAsia"/>
+        </w:rPr>
+        <w:t xml:space="preserve">　　1.</w:t>
+      </w:r>
+    </w:p>
+    <w:tbl>
+      <w:tblPr>
+        <w:tblW w:w="0" w:type="auto"/>
+        <w:tblCellSpacing w:w="15" w:type="dxa"/>
+        <w:tblCellMar>
+          <w:top w:w="15" w:type="dxa"/>
+          <w:left w:w="15" w:type="dxa"/>
+          <w:bottom w:w="15" w:type="dxa"/>
+          <w:right w:w="15" w:type="dxa"/>
+        </w:tblCellMar>
+        <w:tblLook w:val="04A0" w:firstRow="1" w:lastRow="0" w:firstColumn="1" w:lastColumn="0" w:noHBand="0" w:noVBand="1"/>
+      </w:tblPr>
+      <w:tblGrid>
+        <w:gridCol w:w="1786"/>
+        <w:gridCol w:w="1564"/>
+        <w:gridCol w:w="1565"/>
+        <w:gridCol w:w="2835"/>
+      </w:tblGrid>
+      <w:tr>
+        <w:trPr>
+          <w:tblCellSpacing w:w="15" w:type="dxa"/>
+        </w:trPr>
+        <w:tc>
+          <w:tcPr>
+            <w:tcW w:w="0" w:type="auto"/>
+            <w:tcBorders>
+              <w:top w:val="single" w:sz="6" w:space="0" w:color="auto"/>
+              <w:left w:val="single" w:sz="6" w:space="0" w:color="auto"/>
+              <w:bottom w:val="single" w:sz="6" w:space="0" w:color="auto"/>
+              <w:right w:val="single" w:sz="6" w:space="0" w:color="auto"/>
+            </w:tcBorders>
+            <w:vAlign w:val="center"/>
+            <w:hideMark/>
+          </w:tcPr>
+          <w:p>
+            <w:pPr>
+              <w:adjustRightInd w:val="0"/>
+              <w:snapToGrid w:val="0"/>
+              <w:spacing w:line="240" w:lineRule="atLeast"/>
+              <w:rPr>
+                <w:rFonts w:eastAsia="游明朝"/>
+              </w:rPr>
+            </w:pPr>
+            <w:r>
+              <w:rPr>
+                <w:rFonts w:eastAsia="游明朝"/>
+                <w:b/>
+                <w:bCs/>
+              </w:rPr>
+              <w:t>鮮魚対面ガラス</w:t>
+            </w:r>
+          </w:p>
+        </w:tc>
+        <w:tc>
+          <w:tcPr>
+            <w:tcW w:w="0" w:type="auto"/>
+            <w:tcBorders>
+              <w:top w:val="single" w:sz="6" w:space="0" w:color="auto"/>
+              <w:left w:val="single" w:sz="6" w:space="0" w:color="auto"/>
+              <w:bottom w:val="single" w:sz="6" w:space="0" w:color="auto"/>
+              <w:right w:val="single" w:sz="6" w:space="0" w:color="auto"/>
+            </w:tcBorders>
+            <w:vAlign w:val="center"/>
+            <w:hideMark/>
+          </w:tcPr>
+          <w:p>
+            <w:pPr>
+              <w:adjustRightInd w:val="0"/>
+              <w:snapToGrid w:val="0"/>
+              <w:spacing w:line="240" w:lineRule="atLeast"/>
+              <w:rPr>
+                <w:rFonts w:eastAsia="游明朝"/>
+              </w:rPr>
+            </w:pPr>
+            <w:r>
+              <w:rPr>
+                <w:rFonts w:eastAsia="游明朝"/>
+              </w:rPr>
+              <w:t>1500 × 800mm</w:t>
+            </w:r>
+          </w:p>
+        </w:tc>
+        <w:tc>
+          <w:tcPr>
+            <w:tcW w:w="0" w:type="auto"/>
+            <w:tcBorders>
+              <w:top w:val="single" w:sz="6" w:space="0" w:color="auto"/>
+              <w:left w:val="single" w:sz="6" w:space="0" w:color="auto"/>
+              <w:bottom w:val="single" w:sz="6" w:space="0" w:color="auto"/>
+              <w:right w:val="single" w:sz="6" w:space="0" w:color="auto"/>
+            </w:tcBorders>
+            <w:vAlign w:val="center"/>
+            <w:hideMark/>
+          </w:tcPr>
+          <w:p>
+            <w:pPr>
+              <w:adjustRightInd w:val="0"/>
+              <w:snapToGrid w:val="0"/>
+              <w:spacing w:line="240" w:lineRule="atLeast"/>
+              <w:rPr>
+                <w:rFonts w:eastAsia="游明朝"/>
+              </w:rPr>
+            </w:pPr>
+            <w:r>
+              <w:rPr>
+                <w:rFonts w:eastAsia="游明朝"/>
+                <w:b/>
+                <w:bCs/>
+              </w:rPr>
+              <w:t>1000 × 300mm</w:t>
+            </w:r>
+          </w:p>
+        </w:tc>
+        <w:tc>
+          <w:tcPr>
+            <w:tcW w:w="0" w:type="auto"/>
+            <w:tcBorders>
+              <w:top w:val="single" w:sz="6" w:space="0" w:color="auto"/>
+              <w:left w:val="single" w:sz="6" w:space="0" w:color="auto"/>
+              <w:bottom w:val="single" w:sz="6" w:space="0" w:color="auto"/>
+              <w:right w:val="single" w:sz="6" w:space="0" w:color="auto"/>
+            </w:tcBorders>
+            <w:vAlign w:val="center"/>
+            <w:hideMark/>
+          </w:tcPr>
+          <w:p>
+            <w:pPr>
+              <w:adjustRightInd w:val="0"/>
+              <w:snapToGrid w:val="0"/>
+              <w:spacing w:line="240" w:lineRule="atLeast"/>
+              <w:rPr>
+                <w:rFonts w:eastAsia="游明朝"/>
+              </w:rPr>
+            </w:pPr>
+            <w:r>
+              <w:rPr>
+                <w:rFonts w:eastAsia="游明朝"/>
+              </w:rPr>
+              <w:t>シズル感の演出・調理法提案</w:t>
+            </w:r>
+          </w:p>
+        </w:tc>
+      </w:tr>
+      <w:tr>
+        <w:trPr>
+          <w:tblCellSpacing w:w="15" w:type="dxa"/>
+        </w:trPr>
+        <w:tc>
+          <w:tcPr>
+            <w:tcW w:w="0" w:type="auto"/>
+            <w:tcBorders>
+              <w:top w:val="single" w:sz="6" w:space="0" w:color="auto"/>
+              <w:left w:val="single" w:sz="6" w:space="0" w:color="auto"/>
+              <w:bottom w:val="single" w:sz="6" w:space="0" w:color="auto"/>
+              <w:right w:val="single" w:sz="6" w:space="0" w:color="auto"/>
+            </w:tcBorders>
+            <w:vAlign w:val="center"/>
+            <w:hideMark/>
+          </w:tcPr>
+          <w:p>
+            <w:pPr>
+              <w:adjustRightInd w:val="0"/>
+              <w:snapToGrid w:val="0"/>
+              <w:spacing w:line="240" w:lineRule="atLeast"/>
+              <w:rPr>
+                <w:rFonts w:eastAsia="游明朝"/>
+              </w:rPr>
+            </w:pPr>
+            <w:r>
+              <w:rPr>
+                <w:rFonts w:eastAsia="游明朝"/>
+                <w:b/>
+                <w:bCs/>
+              </w:rPr>
+              <w:t>冷蔵庫ドア</w:t>
+            </w:r>
+          </w:p>
+        </w:tc>
+        <w:tc>
+          <w:tcPr>
+            <w:tcW w:w="0" w:type="auto"/>
+            <w:tcBorders>
+              <w:top w:val="single" w:sz="6" w:space="0" w:color="auto"/>
+              <w:left w:val="single" w:sz="6" w:space="0" w:color="auto"/>
+              <w:bottom w:val="single" w:sz="6" w:space="0" w:color="auto"/>
+              <w:right w:val="single" w:sz="6" w:space="0" w:color="auto"/>
+            </w:tcBorders>
+            <w:vAlign w:val="center"/>
+            <w:hideMark/>
+          </w:tcPr>
+          <w:p>
+            <w:pPr>
+              <w:adjustRightInd w:val="0"/>
+              <w:snapToGrid w:val="0"/>
+              <w:spacing w:line="240" w:lineRule="atLeast"/>
+              <w:rPr>
+                <w:rFonts w:eastAsia="游明朝"/>
+              </w:rPr>
+            </w:pPr>
+            <w:r>
+              <w:rPr>
+                <w:rFonts w:eastAsia="游明朝"/>
+              </w:rPr>
+              <w:t>600 × 1600mm</w:t>
+            </w:r>
+          </w:p>
+        </w:tc>
+        <w:tc>
+          <w:tcPr>
+            <w:tcW w:w="0" w:type="auto"/>
+            <w:tcBorders>
+              <w:top w:val="single" w:sz="6" w:space="0" w:color="auto"/>
+              <w:left w:val="single" w:sz="6" w:space="0" w:color="auto"/>
+              <w:bottom w:val="single" w:sz="6" w:space="0" w:color="auto"/>
+              <w:right w:val="single" w:sz="6" w:space="0" w:color="auto"/>
+            </w:tcBorders>
+            <w:vAlign w:val="center"/>
+            <w:hideMark/>
+          </w:tcPr>
+          <w:p>
+            <w:pPr>
+              <w:adjustRightInd w:val="0"/>
+              <w:snapToGrid w:val="0"/>
+              <w:spacing w:line="240" w:lineRule="atLeast"/>
+              <w:rPr>
+                <w:rFonts w:eastAsia="游明朝"/>
+              </w:rPr>
+            </w:pPr>
+            <w:r>
+              <w:rPr>
+                <w:rFonts w:eastAsia="游明朝"/>
+                <w:b/>
+                <w:bCs/>
+              </w:rPr>
+              <w:t>500 × 1000mm</w:t>
+            </w:r>
+          </w:p>
+        </w:tc>
+        <w:tc>
+          <w:tcPr>
+            <w:tcW w:w="0" w:type="auto"/>
+            <w:tcBorders>
+              <w:top w:val="single" w:sz="6" w:space="0" w:color="auto"/>
+              <w:left w:val="single" w:sz="6" w:space="0" w:color="auto"/>
+              <w:bottom w:val="single" w:sz="6" w:space="0" w:color="auto"/>
+              <w:right w:val="single" w:sz="6" w:space="0" w:color="auto"/>
+            </w:tcBorders>
+            <w:vAlign w:val="center"/>
+            <w:hideMark/>
+          </w:tcPr>
+          <w:p>
+            <w:pPr>
+              <w:adjustRightInd w:val="0"/>
+              <w:snapToGrid w:val="0"/>
+              <w:spacing w:line="240" w:lineRule="atLeast"/>
+              <w:rPr>
+                <w:rFonts w:eastAsia="游明朝"/>
+              </w:rPr>
+            </w:pPr>
+            <w:r>
+              <w:rPr>
+                <w:rFonts w:eastAsia="游明朝"/>
+              </w:rPr>
+              <w:t>銘柄訴求・セット買い促進</w:t>
+            </w:r>
+          </w:p>
+        </w:tc>
+      </w:tr>
+      <w:tr>
+        <w:trPr>
+          <w:tblCellSpacing w:w="15" w:type="dxa"/>
+        </w:trPr>
+        <w:tc>
+          <w:tcPr>
+            <w:tcW w:w="0" w:type="auto"/>
+            <w:tcBorders>
+              <w:top w:val="single" w:sz="6" w:space="0" w:color="auto"/>
+              <w:left w:val="single" w:sz="6" w:space="0" w:color="auto"/>
+              <w:bottom w:val="single" w:sz="6" w:space="0" w:color="auto"/>
+              <w:right w:val="single" w:sz="6" w:space="0" w:color="auto"/>
+            </w:tcBorders>
+            <w:vAlign w:val="center"/>
+            <w:hideMark/>
+          </w:tcPr>
+          <w:p>
+            <w:pPr>
+              <w:adjustRightInd w:val="0"/>
+              <w:snapToGrid w:val="0"/>
+              <w:spacing w:line="240" w:lineRule="atLeast"/>
+              <w:rPr>
+                <w:rFonts w:eastAsia="游明朝"/>
+              </w:rPr>
+            </w:pPr>
+            <w:r>
+              <w:rPr>
+                <w:rFonts w:eastAsia="游明朝"/>
+                <w:b/>
+                <w:bCs/>
+              </w:rPr>
+              <w:t>エンド上部</w:t>
+            </w:r>
+          </w:p>
+        </w:tc>
+        <w:tc>
+          <w:tcPr>
+            <w:tcW w:w="0" w:type="auto"/>
+            <w:tcBorders>
+              <w:top w:val="single" w:sz="6" w:space="0" w:color="auto"/>
+              <w:left w:val="single" w:sz="6" w:space="0" w:color="auto"/>
+              <w:bottom w:val="single" w:sz="6" w:space="0" w:color="auto"/>
+              <w:right w:val="single" w:sz="6" w:space="0" w:color="auto"/>
+            </w:tcBorders>
+            <w:vAlign w:val="center"/>
+            <w:hideMark/>
+          </w:tcPr>
+          <w:p>
+            <w:pPr>
+              <w:adjustRightInd w:val="0"/>
+              <w:snapToGrid w:val="0"/>
+              <w:spacing w:line="240" w:lineRule="atLeast"/>
+              <w:rPr>
+                <w:rFonts w:eastAsia="游明朝"/>
+              </w:rPr>
+            </w:pPr>
+            <w:r>
+              <w:rPr>
+                <w:rFonts w:eastAsia="游明朝"/>
+              </w:rPr>
+              <w:t>900 × 300mm</w:t>
+            </w:r>
+          </w:p>
+        </w:tc>
+        <w:tc>
+          <w:tcPr>
+            <w:tcW w:w="0" w:type="auto"/>
+            <w:tcBorders>
+              <w:top w:val="single" w:sz="6" w:space="0" w:color="auto"/>
+              <w:left w:val="single" w:sz="6" w:space="0" w:color="auto"/>
+              <w:bottom w:val="single" w:sz="6" w:space="0" w:color="auto"/>
+              <w:right w:val="single" w:sz="6" w:space="0" w:color="auto"/>
+            </w:tcBorders>
+            <w:vAlign w:val="center"/>
+            <w:hideMark/>
+          </w:tcPr>
+          <w:p>
+            <w:pPr>
+              <w:adjustRightInd w:val="0"/>
+              <w:snapToGrid w:val="0"/>
+              <w:spacing w:line="240" w:lineRule="atLeast"/>
+              <w:rPr>
+                <w:rFonts w:eastAsia="游明朝"/>
+              </w:rPr>
+            </w:pPr>
+            <w:r>
+              <w:rPr>
+                <w:rFonts w:eastAsia="游明朝"/>
+                <w:b/>
+                <w:bCs/>
+              </w:rPr>
+              <w:t>900 × 200mm</w:t>
+            </w:r>
+          </w:p>
+        </w:tc>
+        <w:tc>
+          <w:tcPr>
+            <w:tcW w:w="0" w:type="auto"/>
+            <w:tcBorders>
+              <w:top w:val="single" w:sz="6" w:space="0" w:color="auto"/>
+              <w:left w:val="single" w:sz="6" w:space="0" w:color="auto"/>
+              <w:bottom w:val="single" w:sz="6" w:space="0" w:color="auto"/>
+              <w:right w:val="single" w:sz="6" w:space="0" w:color="auto"/>
+            </w:tcBorders>
+            <w:vAlign w:val="center"/>
+            <w:hideMark/>
+          </w:tcPr>
+          <w:p>
+            <w:pPr>
+              <w:adjustRightInd w:val="0"/>
+              <w:snapToGrid w:val="0"/>
+              <w:spacing w:line="240" w:lineRule="atLeast"/>
+              <w:rPr>
+                <w:rFonts w:eastAsia="游明朝"/>
+              </w:rPr>
+            </w:pPr>
+            <w:r>
+              <w:rPr>
+                <w:rFonts w:eastAsia="游明朝"/>
+              </w:rPr>
+              <w:t>コーナーの視認性アップ</w:t>
+            </w:r>
+          </w:p>
+        </w:tc>
+      </w:tr>
+      <w:tr>
+        <w:trPr>
+          <w:tblCellSpacing w:w="15" w:type="dxa"/>
+        </w:trPr>
+        <w:tc>
+          <w:tcPr>
+            <w:tcW w:w="0" w:type="auto"/>
+            <w:tcBorders>
+              <w:top w:val="single" w:sz="6" w:space="0" w:color="auto"/>
+              <w:left w:val="single" w:sz="6" w:space="0" w:color="auto"/>
+              <w:bottom w:val="single" w:sz="6" w:space="0" w:color="auto"/>
+              <w:right w:val="single" w:sz="6" w:space="0" w:color="auto"/>
+            </w:tcBorders>
+            <w:vAlign w:val="center"/>
+            <w:hideMark/>
+          </w:tcPr>
+          <w:p>
+            <w:pPr>
+              <w:adjustRightInd w:val="0"/>
+              <w:snapToGrid w:val="0"/>
+              <w:spacing w:line="240" w:lineRule="atLeast"/>
+              <w:rPr>
+                <w:rFonts w:eastAsia="游明朝"/>
+              </w:rPr>
+            </w:pPr>
+            <w:r>
+              <w:rPr>
+                <w:rFonts w:eastAsia="游明朝"/>
+                <w:b/>
+                <w:bCs/>
+              </w:rPr>
+              <w:t>棚割り（定番棚）</w:t>
+            </w:r>
+          </w:p>
+        </w:tc>
+        <w:tc>
+          <w:tcPr>
+            <w:tcW w:w="0" w:type="auto"/>
+            <w:tcBorders>
+              <w:top w:val="single" w:sz="6" w:space="0" w:color="auto"/>
+              <w:left w:val="single" w:sz="6" w:space="0" w:color="auto"/>
+              <w:bottom w:val="single" w:sz="6" w:space="0" w:color="auto"/>
+              <w:right w:val="single" w:sz="6" w:space="0" w:color="auto"/>
+            </w:tcBorders>
+            <w:vAlign w:val="center"/>
+            <w:hideMark/>
+          </w:tcPr>
+          <w:p>
+            <w:pPr>
+              <w:adjustRightInd w:val="0"/>
+              <w:snapToGrid w:val="0"/>
+              <w:spacing w:line="240" w:lineRule="atLeast"/>
+              <w:rPr>
+                <w:rFonts w:eastAsia="游明朝"/>
+              </w:rPr>
+            </w:pPr>
+            <w:r>
+              <w:rPr>
+                <w:rFonts w:eastAsia="游明朝"/>
+              </w:rPr>
+              <w:t>900 × 150mm</w:t>
+            </w:r>
+          </w:p>
+        </w:tc>
+        <w:tc>
+          <w:tcPr>
+            <w:tcW w:w="0" w:type="auto"/>
+            <w:tcBorders>
+              <w:top w:val="single" w:sz="6" w:space="0" w:color="auto"/>
+              <w:left w:val="single" w:sz="6" w:space="0" w:color="auto"/>
+              <w:bottom w:val="single" w:sz="6" w:space="0" w:color="auto"/>
+              <w:right w:val="single" w:sz="6" w:space="0" w:color="auto"/>
+            </w:tcBorders>
+            <w:vAlign w:val="center"/>
+            <w:hideMark/>
+          </w:tcPr>
+          <w:p>
+            <w:pPr>
+              <w:adjustRightInd w:val="0"/>
+              <w:snapToGrid w:val="0"/>
+              <w:spacing w:line="240" w:lineRule="atLeast"/>
+              <w:rPr>
+                <w:rFonts w:eastAsia="游明朝"/>
+              </w:rPr>
+            </w:pPr>
+            <w:r>
+              <w:rPr>
+                <w:rFonts w:eastAsia="游明朝"/>
+                <w:b/>
+                <w:bCs/>
+              </w:rPr>
+              <w:t>900 × 100mm</w:t>
+            </w:r>
+          </w:p>
+        </w:tc>
+        <w:tc>
+          <w:tcPr>
+            <w:tcW w:w="0" w:type="auto"/>
+            <w:tcBorders>
+              <w:top w:val="single" w:sz="6" w:space="0" w:color="auto"/>
+              <w:left w:val="single" w:sz="6" w:space="0" w:color="auto"/>
+              <w:bottom w:val="single" w:sz="6" w:space="0" w:color="auto"/>
+              <w:right w:val="single" w:sz="6" w:space="0" w:color="auto"/>
+            </w:tcBorders>
+            <w:vAlign w:val="center"/>
+            <w:hideMark/>
+          </w:tcPr>
+          <w:p>
+            <w:pPr>
+              <w:adjustRightInd w:val="0"/>
+              <w:snapToGrid w:val="0"/>
+              <w:spacing w:line="240" w:lineRule="atLeast"/>
+              <w:rPr>
+                <w:rFonts w:eastAsia="游明朝"/>
+              </w:rPr>
+            </w:pPr>
+            <w:r>
+              <w:rPr>
+                <w:rFonts w:eastAsia="游明朝"/>
+              </w:rPr>
+              <w:t>電子棚札＋動画広告</w:t>
+            </w:r>
+          </w:p>
+        </w:tc>
+      </w:tr>
+    </w:tbl>
+    <w:p>
+      <w:pPr>
+        <w:snapToGrid w:val="0"/>
+        <w:rPr>
+          <w:rFonts w:hint="eastAsia"/>
+        </w:rPr>
+      </w:pPr>
+      <w:r>
+        <w:rPr>
+          <w:rFonts w:hint="eastAsia"/>
+        </w:rPr>
+        <w:t>のサイズに切り分けて、</w:t>
+      </w:r>
+      <w:r>
+        <w:t>送信用コントローラー（送信カード）の設定</w:t>
+      </w:r>
+      <w:r>
+        <w:rPr>
+          <w:rFonts w:hint="eastAsia"/>
+        </w:rPr>
+        <w:t>をして</w:t>
+      </w:r>
+    </w:p>
+    <w:p>
+      <w:pPr>
         <w:snapToGrid w:val="0"/>
         <w:rPr>
           <w:b/>
@@ -385,7 +1460,7 @@
       </w:pPr>
       <w:r>
         <w:pict w14:anchorId="3F6FE39F">
-          <v:rect id="_x0000_i1038" style="width:0;height:1.5pt" o:hralign="center" o:hrstd="t" o:hr="t" fillcolor="#a0a0a0" stroked="f">
+          <v:rect id="_x0000_i1026" style="width:0;height:1.5pt" o:hralign="center" o:hrstd="t" o:hr="t" fillcolor="#a0a0a0" stroked="f">
             <v:textbox inset="5.85pt,.7pt,5.85pt,.7pt"/>
           </v:rect>
         </w:pict>
@@ -446,6 +1521,44 @@
     </w:sectPr>
   </w:body>
 </w:document>
+</file>
+
+<file path=word/endnotes.xml><?xml version="1.0" encoding="utf-8"?>
+<w:endnotes xmlns:wpc="http://schemas.microsoft.com/office/word/2010/wordprocessingCanvas" xmlns:cx="http://schemas.microsoft.com/office/drawing/2014/chartex" xmlns:cx1="http://schemas.microsoft.com/office/drawing/2015/9/8/chartex" xmlns:cx2="http://schemas.microsoft.com/office/drawing/2015/10/21/chartex" xmlns:cx3="http://schemas.microsoft.com/office/drawing/2016/5/9/chartex" xmlns:cx4="http://schemas.microsoft.com/office/drawing/2016/5/10/chartex" xmlns:cx5="http://schemas.microsoft.com/office/drawing/2016/5/11/chartex" xmlns:cx6="http://schemas.microsoft.com/office/drawing/2016/5/12/chartex" xmlns:cx7="http://schemas.microsoft.com/office/drawing/2016/5/13/chartex" xmlns:cx8="http://schemas.microsoft.com/office/drawing/2016/5/14/chartex" xmlns:mc="http://schemas.openxmlformats.org/markup-compatibility/2006" xmlns:aink="http://schemas.microsoft.com/office/drawing/2016/ink" xmlns:am3d="http://schemas.microsoft.com/office/drawing/2017/model3d" xmlns:o="urn:schemas-microsoft-com:office:office" xmlns:oel="http://schemas.microsoft.com/office/2019/extlst" xmlns:r="http://schemas.openxmlformats.org/officeDocument/2006/relationships" xmlns:m="http://schemas.openxmlformats.org/officeDocument/2006/math" xmlns:v="urn:schemas-microsoft-com:vml" xmlns:wp14="http://schemas.microsoft.com/office/word/2010/wordprocessingDrawing" xmlns:wp="http://schemas.openxmlformats.org/drawingml/2006/wordprocessingDrawing" xmlns:w10="urn:schemas-microsoft-com:office:word" xmlns:w="http://schemas.openxmlformats.org/wordprocessingml/2006/main" xmlns:w14="http://schemas.microsoft.com/office/word/2010/wordml" xmlns:w15="http://schemas.microsoft.com/office/word/2012/wordml" xmlns:w16cex="http://schemas.microsoft.com/office/word/2018/wordml/cex" xmlns:w16cid="http://schemas.microsoft.com/office/word/2016/wordml/cid" xmlns:w16="http://schemas.microsoft.com/office/word/2018/wordml" xmlns:w16du="http://schemas.microsoft.com/office/word/2023/wordml/word16du" xmlns:w16sdtdh="http://schemas.microsoft.com/office/word/2020/wordml/sdtdatahash" xmlns:w16sdtfl="http://schemas.microsoft.com/office/word/2024/wordml/sdtformatlock" xmlns:w16se="http://schemas.microsoft.com/office/word/2015/wordml/symex" xmlns:wpg="http://schemas.microsoft.com/office/word/2010/wordprocessingGroup" xmlns:wpi="http://schemas.microsoft.com/office/word/2010/wordprocessingInk" xmlns:wne="http://schemas.microsoft.com/office/word/2006/wordml" xmlns:wps="http://schemas.microsoft.com/office/word/2010/wordprocessingShape" mc:Ignorable="w14 w15 w16se w16cid w16 w16cex w16sdtdh w16sdtfl w16du wp14">
+  <w:endnote w:type="separator" w:id="-1">
+    <w:p>
+      <w:r>
+        <w:separator/>
+      </w:r>
+    </w:p>
+  </w:endnote>
+  <w:endnote w:type="continuationSeparator" w:id="0">
+    <w:p>
+      <w:r>
+        <w:continuationSeparator/>
+      </w:r>
+    </w:p>
+  </w:endnote>
+</w:endnotes>
+</file>
+
+<file path=word/footnotes.xml><?xml version="1.0" encoding="utf-8"?>
+<w:footnotes xmlns:wpc="http://schemas.microsoft.com/office/word/2010/wordprocessingCanvas" xmlns:cx="http://schemas.microsoft.com/office/drawing/2014/chartex" xmlns:cx1="http://schemas.microsoft.com/office/drawing/2015/9/8/chartex" xmlns:cx2="http://schemas.microsoft.com/office/drawing/2015/10/21/chartex" xmlns:cx3="http://schemas.microsoft.com/office/drawing/2016/5/9/chartex" xmlns:cx4="http://schemas.microsoft.com/office/drawing/2016/5/10/chartex" xmlns:cx5="http://schemas.microsoft.com/office/drawing/2016/5/11/chartex" xmlns:cx6="http://schemas.microsoft.com/office/drawing/2016/5/12/chartex" xmlns:cx7="http://schemas.microsoft.com/office/drawing/2016/5/13/chartex" xmlns:cx8="http://schemas.microsoft.com/office/drawing/2016/5/14/chartex" xmlns:mc="http://schemas.openxmlformats.org/markup-compatibility/2006" xmlns:aink="http://schemas.microsoft.com/office/drawing/2016/ink" xmlns:am3d="http://schemas.microsoft.com/office/drawing/2017/model3d" xmlns:o="urn:schemas-microsoft-com:office:office" xmlns:oel="http://schemas.microsoft.com/office/2019/extlst" xmlns:r="http://schemas.openxmlformats.org/officeDocument/2006/relationships" xmlns:m="http://schemas.openxmlformats.org/officeDocument/2006/math" xmlns:v="urn:schemas-microsoft-com:vml" xmlns:wp14="http://schemas.microsoft.com/office/word/2010/wordprocessingDrawing" xmlns:wp="http://schemas.openxmlformats.org/drawingml/2006/wordprocessingDrawing" xmlns:w10="urn:schemas-microsoft-com:office:word" xmlns:w="http://schemas.openxmlformats.org/wordprocessingml/2006/main" xmlns:w14="http://schemas.microsoft.com/office/word/2010/wordml" xmlns:w15="http://schemas.microsoft.com/office/word/2012/wordml" xmlns:w16cex="http://schemas.microsoft.com/office/word/2018/wordml/cex" xmlns:w16cid="http://schemas.microsoft.com/office/word/2016/wordml/cid" xmlns:w16="http://schemas.microsoft.com/office/word/2018/wordml" xmlns:w16du="http://schemas.microsoft.com/office/word/2023/wordml/word16du" xmlns:w16sdtdh="http://schemas.microsoft.com/office/word/2020/wordml/sdtdatahash" xmlns:w16sdtfl="http://schemas.microsoft.com/office/word/2024/wordml/sdtformatlock" xmlns:w16se="http://schemas.microsoft.com/office/word/2015/wordml/symex" xmlns:wpg="http://schemas.microsoft.com/office/word/2010/wordprocessingGroup" xmlns:wpi="http://schemas.microsoft.com/office/word/2010/wordprocessingInk" xmlns:wne="http://schemas.microsoft.com/office/word/2006/wordml" xmlns:wps="http://schemas.microsoft.com/office/word/2010/wordprocessingShape" mc:Ignorable="w14 w15 w16se w16cid w16 w16cex w16sdtdh w16sdtfl w16du wp14">
+  <w:footnote w:type="separator" w:id="-1">
+    <w:p>
+      <w:r>
+        <w:separator/>
+      </w:r>
+    </w:p>
+  </w:footnote>
+  <w:footnote w:type="continuationSeparator" w:id="0">
+    <w:p>
+      <w:r>
+        <w:continuationSeparator/>
+      </w:r>
+    </w:p>
+  </w:footnote>
+</w:footnotes>
 </file>
 
 <file path=word/numbering.xml><?xml version="1.0" encoding="utf-8"?>
@@ -1937,6 +3050,55 @@
       <w:spacing w:val="5"/>
     </w:rPr>
   </w:style>
+  <w:style w:type="paragraph" w:styleId="aa">
+    <w:name w:val="header"/>
+    <w:basedOn w:val="a"/>
+    <w:link w:val="ab"/>
+    <w:uiPriority w:val="99"/>
+    <w:unhideWhenUsed/>
+    <w:rsid w:val="001364D6"/>
+    <w:pPr>
+      <w:tabs>
+        <w:tab w:val="center" w:pos="4252"/>
+        <w:tab w:val="right" w:pos="8504"/>
+      </w:tabs>
+      <w:snapToGrid w:val="0"/>
+    </w:pPr>
+  </w:style>
+  <w:style w:type="character" w:customStyle="1" w:styleId="ab">
+    <w:name w:val="ヘッダー (文字)"/>
+    <w:basedOn w:val="a0"/>
+    <w:link w:val="aa"/>
+    <w:uiPriority w:val="99"/>
+    <w:rsid w:val="001364D6"/>
+  </w:style>
+  <w:style w:type="paragraph" w:styleId="ac">
+    <w:name w:val="footer"/>
+    <w:basedOn w:val="a"/>
+    <w:link w:val="ad"/>
+    <w:uiPriority w:val="99"/>
+    <w:unhideWhenUsed/>
+    <w:rsid w:val="001364D6"/>
+    <w:pPr>
+      <w:tabs>
+        <w:tab w:val="center" w:pos="4252"/>
+        <w:tab w:val="right" w:pos="8504"/>
+      </w:tabs>
+      <w:snapToGrid w:val="0"/>
+    </w:pPr>
+  </w:style>
+  <w:style w:type="character" w:customStyle="1" w:styleId="ad">
+    <w:name w:val="フッター (文字)"/>
+    <w:basedOn w:val="a0"/>
+    <w:link w:val="ac"/>
+    <w:uiPriority w:val="99"/>
+    <w:rsid w:val="001364D6"/>
+  </w:style>
+  <w:style w:type="character" w:customStyle="1" w:styleId="mtk1">
+    <w:name w:val="mtk1"/>
+    <w:basedOn w:val="a0"/>
+    <w:rsid w:val="006E30D6"/>
+  </w:style>
 </w:styles>
 </file>
 

</xml_diff>